<commit_message>
release: publish auditable Plant-CellFM specialist agents
</commit_message>
<xml_diff>
--- a/manuscript/plant_methods_submission_v1/Plant_CellFM_Plant_Methods_manuscript_v1.docx
+++ b/manuscript/plant_methods_submission_v1/Plant_CellFM_Plant_Methods_manuscript_v1.docx
@@ -160,7 +160,7 @@
         <w:t xml:space="preserve">Sorghum</w:t>
       </w:r>
       <w:r>
-        <w:t xml:space="preserve"> cells with compatible broad identities, adaptation increased accuracy from 14.79% to 84.98%.</w:t>
+        <w:t xml:space="preserve"> cells with compatible broad identities, adaptation increased accuracy from 14.79% to 84.98%. The PlantCell-Agent deployment layer preserved direct predictions while enriching the review queue for errors: at a 0.70 threshold, review-group error exceeded accepted-group error by 31.00-44.72 percentage points across three end-to-end replays and the strict 3,964-cell locked-output replay.</w:t>
       </w:r>
     </w:p>
     <w:p>
@@ -181,7 +181,7 @@
         <w:jc w:val="both"/>
       </w:pPr>
       <w:r>
-        <w:t xml:space="preserve">Plant-CellFM identifies the label-coverage limit of cross-species plant annotation and provides a parameter-efficient route for recovering species- and study-specific cell states. Reporting source-only recognition and target-supervised recovery as separate endpoints yields a practical framework for annotating new plant atlases without masking unsupported-label failure.</w:t>
+        <w:t xml:space="preserve">Plant-CellFM identifies the label-coverage limit of cross-species plant annotation and provides a parameter-efficient route for recovering species- and study-specific cell states. The optional PlantCell-Agent converts these model outputs into an auditable plan--act--verify workflow with explicit routing, open-set handling and manual-review traces, without changing the underlying checkpoint or primary benchmark denominators. Reporting source-only recognition and target-supervised recovery as separate endpoints yields a practical framework for annotating new plant atlases without masking unsupported-label failure.</w:t>
       </w:r>
     </w:p>
     <w:p>
@@ -198,7 +198,7 @@
         <w:t xml:space="preserve">Keywords:</w:t>
       </w:r>
       <w:r>
-        <w:t xml:space="preserve"> plant single-cell transcriptomics; cell-type annotation; cross-species transfer; label coverage; LoRA; orthology; species adaptation</w:t>
+        <w:t xml:space="preserve"> plant single-cell transcriptomics; cell-type annotation; cross-species transfer; label coverage; selective prediction; uncertainty calibration; scientific agent; LoRA; orthology; species adaptation</w:t>
       </w:r>
     </w:p>
     <w:p>
@@ -5120,6 +5120,103 @@
         <w:jc w:val="left"/>
       </w:pPr>
       <w:r>
+        <w:t xml:space="preserve">Evidence-aware agentic annotation</w:t>
+      </w:r>
+    </w:p>
+    <w:p>
+      <w:pPr>
+        <w:widowControl/>
+        <w:spacing w:after="0" w:before="0" w:line="480" w:lineRule="auto"/>
+        <w:jc w:val="both"/>
+      </w:pPr>
+      <w:r>
+        <w:t xml:space="preserve">To make these controls usable on a new input object, we added PlantCell-Agent as a deterministic orchestration layer around the unchanged Plant-CellFM checkpoint. The agent does not introduce a second predictor or alter model weights. It first audits the input object (cell and gene counts, expression layer, identifier overlap, species and tissue metadata, and usable label support), canonicalizes species aliases, and resolves the most specific registered adapter. It then routes the run to one of four declared paths: a registered species adapter, an orthology-projected cross-species route, a universal open-set fallback when no reliable map is available, or a few-shot route when at least eight labelled support cells are supplied. Each route is represented by a capability-scoped specialist agent with a declared input contract, output contract, evidence requirements and fallback chain; the central model remains the shared embedding and prediction service. After inference, the evidence agent verifies confidence, label coverage, open-set outcomes, marker evidence, ontology consistency and output-artifact integrity. Runs that fail the declared coverage or confidence contract are written to a review queue rather than silently promoted to automatic annotation. For orthology-routed runs, a single alternate aggregation retry is permitted and is selected only when it improves accepted-cell coverage and accepted confidence. Every decision is recorded in machine-readable </w:t>
+      </w:r>
+      <w:r>
+        <w:rPr>
+          <w:rFonts w:ascii="Courier New" w:cs="Courier New" w:eastAsia="Courier New" w:hAnsi="Courier New"/>
+          <w:sz w:val="19"/>
+          <w:szCs w:val="19"/>
+        </w:rPr>
+        <w:t xml:space="preserve">agent_plan.json</w:t>
+      </w:r>
+      <w:r>
+        <w:t xml:space="preserve">, </w:t>
+      </w:r>
+      <w:r>
+        <w:rPr>
+          <w:rFonts w:ascii="Courier New" w:cs="Courier New" w:eastAsia="Courier New" w:hAnsi="Courier New"/>
+          <w:sz w:val="19"/>
+          <w:szCs w:val="19"/>
+        </w:rPr>
+        <w:t xml:space="preserve">specialist_plan.json</w:t>
+      </w:r>
+      <w:r>
+        <w:t xml:space="preserve">, </w:t>
+      </w:r>
+      <w:r>
+        <w:rPr>
+          <w:rFonts w:ascii="Courier New" w:cs="Courier New" w:eastAsia="Courier New" w:hAnsi="Courier New"/>
+          <w:sz w:val="19"/>
+          <w:szCs w:val="19"/>
+        </w:rPr>
+        <w:t xml:space="preserve">specialist_capabilities.json</w:t>
+      </w:r>
+      <w:r>
+        <w:t xml:space="preserve">, </w:t>
+      </w:r>
+      <w:r>
+        <w:rPr>
+          <w:rFonts w:ascii="Courier New" w:cs="Courier New" w:eastAsia="Courier New" w:hAnsi="Courier New"/>
+          <w:sz w:val="19"/>
+          <w:szCs w:val="19"/>
+        </w:rPr>
+        <w:t xml:space="preserve">evidence_verification.json</w:t>
+      </w:r>
+      <w:r>
+        <w:t xml:space="preserve">, </w:t>
+      </w:r>
+      <w:r>
+        <w:rPr>
+          <w:rFonts w:ascii="Courier New" w:cs="Courier New" w:eastAsia="Courier New" w:hAnsi="Courier New"/>
+          <w:sz w:val="19"/>
+          <w:szCs w:val="19"/>
+        </w:rPr>
+        <w:t xml:space="preserve">agent_trace.jsonl</w:t>
+      </w:r>
+      <w:r>
+        <w:t xml:space="preserve"> and </w:t>
+      </w:r>
+      <w:r>
+        <w:rPr>
+          <w:rFonts w:ascii="Courier New" w:cs="Courier New" w:eastAsia="Courier New" w:hAnsi="Courier New"/>
+          <w:sz w:val="19"/>
+          <w:szCs w:val="19"/>
+        </w:rPr>
+        <w:t xml:space="preserve">route_decision.json</w:t>
+      </w:r>
+      <w:r>
+        <w:t xml:space="preserve"> files alongside the unchanged cell-level predictions and embeddings.</w:t>
+      </w:r>
+    </w:p>
+    <w:p>
+      <w:pPr>
+        <w:widowControl/>
+        <w:spacing w:after="0" w:before="0" w:line="480" w:lineRule="auto"/>
+        <w:jc w:val="both"/>
+      </w:pPr>
+      <w:r>
+        <w:t xml:space="preserve">For workflow evaluation, we compared an accept-all direct baseline with the Agent threshold policy at thresholds 0.50, 0.60, 0.70, 0.80 and 0.90. At each threshold, coverage, accepted accuracy, accepted risk, review risk, error capture and open-set capture were calculated on the complete matched cell denominator. Confidence calibration used ten equal-width bins and the expected calibration error (ECE). The strict 3,964-cell case used the locked prediction bundle and cell-level author labels because the raw H5AD object was unavailable in the execution workspace; it is therefore identified as a locked-bundle replay rather than an end-to-end input replay. For expert verification, the software exports a stratified worksheet containing accepted and review cells while hiding the acceptance group and reference label. A separate key supports scoring after independent review.</w:t>
+      </w:r>
+    </w:p>
+    <w:p>
+      <w:pPr>
+        <w:pStyle w:val="Heading2"/>
+        <w:keepNext/>
+        <w:spacing w:after="80" w:before="200" w:line="276" w:lineRule="auto"/>
+        <w:jc w:val="left"/>
+      </w:pPr>
+      <w:r>
         <w:t xml:space="preserve">Low-rank species adaptation</w:t>
       </w:r>
     </w:p>
@@ -9953,6 +10050,27 @@
     </w:p>
     <w:p>
       <w:pPr>
+        <w:widowControl/>
+        <w:spacing w:after="0" w:before="0" w:line="480" w:lineRule="auto"/>
+        <w:jc w:val="both"/>
+      </w:pPr>
+      <w:r>
+        <w:t xml:space="preserve">The optional PlantCell-Agent layer is invoked with </w:t>
+      </w:r>
+      <w:r>
+        <w:rPr>
+          <w:rFonts w:ascii="Courier New" w:cs="Courier New" w:eastAsia="Courier New" w:hAnsi="Courier New"/>
+          <w:sz w:val="19"/>
+          <w:szCs w:val="19"/>
+        </w:rPr>
+        <w:t xml:space="preserve">snowcell agent-annotate</w:t>
+      </w:r>
+      <w:r>
+        <w:t xml:space="preserve">; it preserves the direct inference output and adds an auditable route, review and provenance record. Agent replay is therefore evaluated as a workflow-level property and is not interpreted as an improvement to the underlying all-cell classifier.</w:t>
+      </w:r>
+    </w:p>
+    <w:p>
+      <w:pPr>
         <w:pStyle w:val="Heading2"/>
         <w:keepNext/>
         <w:spacing w:after="80" w:before="200" w:line="276" w:lineRule="auto"/>
@@ -10021,7 +10139,7 @@
         <w:jc w:val="both"/>
       </w:pPr>
       <w:r>
-        <w:t xml:space="preserve">This separation is necessary because the tasks have different attainable label spaces. A source-only decoder cannot predict an identity that is absent from its source vocabulary, whereas an adapter can learn that identity from target support cells. We therefore retained the complete all-cell denominator for frozen-encoder transfer and reported target-supervised adaptation on disjoint or sealed test sets.</w:t>
+        <w:t xml:space="preserve">This separation is necessary because the tasks have different attainable label spaces. A source-only decoder cannot predict an identity that is absent from its source vocabulary, whereas an adapter can learn that identity from target support cells. We therefore retained the complete all-cell denominator for frozen-encoder transfer and reported target-supervised adaptation on disjoint or sealed test sets. For deployment, we additionally treated automatic release as a decision problem: the accept-all output is the baseline, whereas PlantCell-Agent can abstain and send low-confidence or unsupported cells to review.</w:t>
       </w:r>
     </w:p>
     <w:p>
@@ -10032,6 +10150,48 @@
       </w:pPr>
       <w:r>
         <w:t xml:space="preserve">Four features distinguish the framework from a closed-set annotation benchmark (Table 2). First, the leave-species protocol reports the complete denominator together with label coverage, preventing unsupported target states from being silently removed. Second, source-derived organ and family context is evaluated as a separate routing layer, so its benefit can be assigned to covered labels rather than to unavailable classes. Third, target-labelled support is treated as an explicit experimental variable, allowing annotation effort to be related to query accuracy and macro-F1. Fourth, external wheat and Sorghum experiments retain locked barcodes or locked libraries, giving adaptation results that can be audited independently of the training and validation splits.</w:t>
+      </w:r>
+    </w:p>
+    <w:p>
+      <w:pPr>
+        <w:pStyle w:val="Heading2"/>
+        <w:keepNext/>
+        <w:spacing w:after="80" w:before="200" w:line="276" w:lineRule="auto"/>
+        <w:jc w:val="left"/>
+      </w:pPr>
+      <w:r>
+        <w:t xml:space="preserve">PlantCell-Agent preserves the denominator while increasing annotation reliability</w:t>
+      </w:r>
+    </w:p>
+    <w:p>
+      <w:pPr>
+        <w:widowControl/>
+        <w:spacing w:after="0" w:before="0" w:line="480" w:lineRule="auto"/>
+        <w:jc w:val="both"/>
+      </w:pPr>
+      <w:r>
+        <w:t xml:space="preserve">We next tested the agent as a deployment layer on three independent, author-labelled objects without retraining the backbone or changing any checkpoint. It selected the registered adapter for the Arabidopsis secondary-root object, the registered adapter for wheat, and the orthology-projected STC route for Sorghum. Direct and agent predictions were identical at the cell level; the contribution of the agent was to expose metadata mismatches, retain open-set outcomes, and separate accepted cells from cells requiring review. On Arabidopsis, the all-cell accuracy was 86.64% and macro-F1 was 0.8740; 84.17% of cells passed the acceptance contract, with 92.41% accuracy and 0.9253 macro-F1 among accepted cells. On wheat, all-cell accuracy was 64.71% and macro-F1 was 0.6935, while the accepted subset reached 82.89% accuracy; 58.64% of cells were routed to review because coverage was insufficient. On Sorghum, all-cell accuracy was 82.19% and macro-F1 was 0.8322, with 77.58% accepted coverage and 90.82% accuracy among accepted cells. Exact hashes of predictions and embeddings matched independent repeat runs for all three objects. In the strict 3,964-cell locked-bundle replay, the Agent accepted 56.48% of cells at 85.71% reference accuracy; the review group had 59.01% error versus 14.29% among accepted cells. The raw strict H5AD was unavailable, so this result is explicitly a locked-output replay rather than an end-to-end input replay.</w:t>
+      </w:r>
+    </w:p>
+    <w:p>
+      <w:pPr>
+        <w:pStyle w:val="Heading2"/>
+        <w:keepNext/>
+        <w:spacing w:after="80" w:before="200" w:line="276" w:lineRule="auto"/>
+        <w:jc w:val="left"/>
+      </w:pPr>
+      <w:r>
+        <w:t xml:space="preserve">Selective-risk and expert-audit evidence</w:t>
+      </w:r>
+    </w:p>
+    <w:p>
+      <w:pPr>
+        <w:widowControl/>
+        <w:spacing w:after="0" w:before="0" w:line="480" w:lineRule="auto"/>
+        <w:jc w:val="both"/>
+      </w:pPr>
+      <w:r>
+        <w:t xml:space="preserve">At the prespecified 0.70 review threshold, the review-group error rate exceeded the accepted-group error rate by 44.72 percentage points in the strict locked bundle. The corresponding separations were 36.45, 31.00 and 38.49 percentage points for Arabidopsis, wheat and Sorghum, respectively. Confidence calibration was strong in the three end-to-end replays, with ECE values of 0.0104, 0.0343 and 0.0133; the strict locked bundle had ECE 0.0769. Direct and final Agent labels agreed for every cell in all four cases, showing that the reliability gain comes from selective release and review triage rather than a hidden checkpoint change. The reference-backed audit uses existing author labels; the exported blinded worksheet must be completed by an independent expert before this evidence is described as independent expert validation.</w:t>
       </w:r>
     </w:p>
     <w:p>
@@ -10398,6 +10558,69 @@
           </w:p>
         </w:tc>
       </w:tr>
+      <w:tr>
+        <w:trPr>
+          <w:cantSplit/>
+          <w:tblHeader w:val="false"/>
+        </w:trPr>
+        <w:tc>
+          <w:tcPr>
+            <w:tcW w:type="pct" w:w="33.333333333333336%"/>
+            <w:tcMar>
+              <w:top w:type="dxa" w:w="70"/>
+              <w:left w:type="dxa" w:w="90"/>
+              <w:bottom w:type="dxa" w:w="70"/>
+              <w:right w:type="dxa" w:w="90"/>
+            </w:tcMar>
+          </w:tcPr>
+          <w:p>
+            <w:pPr>
+              <w:spacing w:after="0" w:before="0" w:line="240" w:lineRule="auto"/>
+            </w:pPr>
+            <w:r>
+              <w:t xml:space="preserve">Selective, auditable release</w:t>
+            </w:r>
+          </w:p>
+        </w:tc>
+        <w:tc>
+          <w:tcPr>
+            <w:tcW w:type="pct" w:w="33.333333333333336%"/>
+            <w:tcMar>
+              <w:top w:type="dxa" w:w="70"/>
+              <w:left w:type="dxa" w:w="90"/>
+              <w:bottom w:type="dxa" w:w="70"/>
+              <w:right w:type="dxa" w:w="90"/>
+            </w:tcMar>
+          </w:tcPr>
+          <w:p>
+            <w:pPr>
+              <w:spacing w:after="0" w:before="0" w:line="240" w:lineRule="auto"/>
+            </w:pPr>
+            <w:r>
+              <w:t xml:space="preserve">At threshold 0.70, review error exceeded accepted error by 31.00-44.72 percentage points; ECE was 0.0104-0.0769</w:t>
+            </w:r>
+          </w:p>
+        </w:tc>
+        <w:tc>
+          <w:tcPr>
+            <w:tcW w:type="pct" w:w="33.333333333333336%"/>
+            <w:tcMar>
+              <w:top w:type="dxa" w:w="70"/>
+              <w:left w:type="dxa" w:w="90"/>
+              <w:bottom w:type="dxa" w:w="70"/>
+              <w:right w:type="dxa" w:w="90"/>
+            </w:tcMar>
+          </w:tcPr>
+          <w:p>
+            <w:pPr>
+              <w:spacing w:after="0" w:before="0" w:line="240" w:lineRule="auto"/>
+            </w:pPr>
+            <w:r>
+              <w:t xml:space="preserve">Agent policy; strict case is locked-output replay and the audit is reference-backed until the blinded worksheet is independently completed</w:t>
+            </w:r>
+          </w:p>
+        </w:tc>
+      </w:tr>
     </w:tbl>
     <w:p>
       <w:pPr>
@@ -10857,6 +11080,16 @@
         <w:jc w:val="both"/>
       </w:pPr>
       <w:r>
+        <w:t xml:space="preserve">PlantCell-Agent adds a separate operational contribution to this model design. It converts confidence, label coverage, open-set status and ontology checks into an explicit release decision, while preserving the original predictions and their complete denominator. The accept-all baseline and the Agent threshold policies can therefore be compared as a selective-prediction problem rather than as an undocumented post-processing step. Across the four audited cases, the review branch was consistently enriched for reference errors, and the calibration curves quantify how much confidence can be trusted before a cell is released automatically. The independent expert worksheet is blinded to the acceptance group and reference label; until it is completed, the present separation is correctly described as reference-backed rather than independent expert validation.</w:t>
+      </w:r>
+    </w:p>
+    <w:p>
+      <w:pPr>
+        <w:widowControl/>
+        <w:spacing w:after="0" w:before="0" w:line="480" w:lineRule="auto"/>
+        <w:jc w:val="both"/>
+      </w:pPr>
+      <w:r>
         <w:t xml:space="preserve">The biological evidence is strongest for root tissues. Marker expression supported five of six predefined identities in the label-free </w:t>
       </w:r>
       <w:r>
@@ -10918,7 +11151,7 @@
         <w:jc w:val="both"/>
       </w:pPr>
       <w:r>
-        <w:t xml:space="preserve">Plant-CellFM separates cross-species plant annotation into label recognition, context-guided routing and target-specific recovery. Frozen-encoder decoder evaluation showed that absent source labels explain a substantial fraction of leave-species error, while sparse rank-8 adaptation recovered study-specific states in </w:t>
+        <w:t xml:space="preserve">Plant-CellFM separates cross-species plant annotation into label recognition, context-guided routing and target-specific recovery. PlantCell-Agent adds a reproducible audit, abstention and review layer that preserves direct model outputs while making selective reliability measurable. Frozen-encoder decoder evaluation showed that absent source labels explain a substantial fraction of leave-species error, while sparse rank-8 adaptation recovered study-specific states in </w:t>
       </w:r>
       <w:r>
         <w:rPr>
@@ -10938,7 +11171,7 @@
         <w:t xml:space="preserve">Sorghum</w:t>
       </w:r>
       <w:r>
-        <w:t xml:space="preserve">. The resulting workflow provides a reproducible basis for deciding when a shared plant representation is sufficient and when new target annotation is required.</w:t>
+        <w:t xml:space="preserve">. Together, the model and agent provide a reproducible basis for deciding when a shared plant representation is sufficient, when a prediction should be reviewed and when new target annotation is required.</w:t>
       </w:r>
     </w:p>
     <w:p>
@@ -11194,7 +11427,18 @@
         <w:t xml:space="preserve">Additional file 2. PDF. Plant-CellFM Supplementary Figures.</w:t>
       </w:r>
       <w:r>
-        <w:t xml:space="preserve"> Supplementary Figs. S1-S11 covering leave-species uncertainty, confidence-selective annotation, checkpoint comparison, Sorghum replication and state-level errors, Arabidopsis marker programs, secondary-root adaptation, wheat comparator results, source-only transfer and the multi-species marker resource.</w:t>
+        <w:t xml:space="preserve"> </w:t>
+      </w:r>
+      <w:r>
+        <w:rPr>
+          <w:rFonts w:ascii="Courier New" w:cs="Courier New" w:eastAsia="Courier New" w:hAnsi="Courier New"/>
+          <w:sz w:val="19"/>
+          <w:szCs w:val="19"/>
+        </w:rPr>
+        <w:t xml:space="preserve">Plant_CellFM_Plant_Methods_supplementary_figures_v4.pdf</w:t>
+      </w:r>
+      <w:r>
+        <w:t xml:space="preserve">, containing Supplementary Figs. S1-S13 covering leave-species uncertainty, confidence-selective annotation, checkpoint comparison, Sorghum replication and state-level errors, Arabidopsis marker programs, secondary-root adaptation, wheat comparator results, source-only transfer, the multi-species marker resource, the central-model specialist-agent architecture and selective-reliability evidence.</w:t>
       </w:r>
     </w:p>
     <w:p>
@@ -11208,10 +11452,10 @@
           <w:b/>
           <w:bCs/>
         </w:rPr>
-        <w:t xml:space="preserve">Additional file 3. XLSX. Plant-CellFM Supplementary Tables S1-S27.</w:t>
-      </w:r>
-      <w:r>
-        <w:t xml:space="preserve"> Data provenance, task definitions, species-resolved results, nested selection, few-shot draws, comparator results, marker candidates and external analyses.</w:t>
+        <w:t xml:space="preserve">Additional file 3. XLSX. Plant-CellFM Supplementary Tables S1-S29.</w:t>
+      </w:r>
+      <w:r>
+        <w:t xml:space="preserve"> Data provenance, task definitions, species-resolved results, nested selection, few-shot draws, comparator results, marker candidates, external analyses, the PlantCell-Agent replay contract and selective-risk/expert-audit evidence.</w:t>
       </w:r>
     </w:p>
     <w:p>
@@ -11256,7 +11500,7 @@
         <w:t xml:space="preserve">Fig. 1 Plant-CellFM architecture and annotation tasks.</w:t>
       </w:r>
       <w:r>
-        <w:t xml:space="preserve"> a, Plant expression matrices enter through exact gene identifiers or a specified orthology map. b, A four-layer set transformer combines gene identity and expression values into a 256-dimensional cell representation. c, The model returns hierarchical identities, confidence scores and marker candidates. d, Rank-8 modules adapt the shared representation to species- or study-specific vocabularies. e, The training corpus and evaluation panels define explicit roles for each downstream protocol. f, Frozen-encoder transfer, context calibration, sparse support and study-level adaptation use different target information. Conceptual panels contain no quantitative data.</w:t>
+        <w:t xml:space="preserve"> a, Plant expression matrices enter through exact gene identifiers or a specified orthology map. b, A four-layer set transformer combines gene identity and expression values into a 256-dimensional cell representation. c, The model returns hierarchical identities, confidence scores and marker candidates. d, Rank-8 modules adapt the shared representation to species- or study-specific vocabularies. e, The training corpus and evaluation panels define explicit roles for each downstream protocol. f, Frozen-encoder transfer, context calibration, sparse support and study-level adaptation use different target information. A thin outer vector loop marks the optional PlantCell-Agent audit--route--verify layer around the existing system panel; it does not alter any quantitative panel. Supplementary Fig. S12 expands the workflow with the central model, specialist agents, evidence verification and review outputs. Conceptual panels contain no quantitative data.</w:t>
       </w:r>
     </w:p>
     <w:p>

</xml_diff>